<commit_message>
Simplify PRA guide to SQL and Excel and remove handoff document
</commit_message>
<xml_diff>
--- a/docs/generated/BSCR-Jan-2026.docx
+++ b/docs/generated/BSCR-Jan-2026.docx
@@ -1408,7 +1408,7 @@
         <w:rPr>
           <w:rStyle w:val="VerbatimChar"/>
         </w:rPr>
-        <w:t xml:space="preserve">11829071974c94f7418dbf71c0d0eb21f313595c</w:t>
+        <w:t xml:space="preserve">e24520a521577b73e2f98d6ddc64525d320b12b0</w:t>
       </w:r>
       <w:r>
         <w:t xml:space="preserve"> </w:t>
@@ -1435,7 +1435,7 @@
         <w:rPr>
           <w:rStyle w:val="VerbatimChar"/>
         </w:rPr>
-        <w:t xml:space="preserve">765e4a76df782e41f11d22fbd047c32337d86646f12e7c3af301a86318c6b023</w:t>
+        <w:t xml:space="preserve">865d85a521d3e2696c1a42dfd93528077803da83719ca46d3141a0066f77919f</w:t>
       </w:r>
       <w:r>
         <w:t xml:space="preserve">.</w:t>

</xml_diff>

<commit_message>
Remove source identity appendix from generated Word guides
</commit_message>
<xml_diff>
--- a/docs/generated/BSCR-Jan-2026.docx
+++ b/docs/generated/BSCR-Jan-2026.docx
@@ -16,14 +16,6 @@
       </w:pPr>
       <w:r>
         <w:t xml:space="preserve">January 2026</w:t>
-      </w:r>
-    </w:p>
-    <w:p>
-      <w:pPr>
-        <w:pStyle w:val="BlockText"/>
-      </w:pPr>
-      <w:r>
-        <w:t xml:space="preserve">Short operator guide. Detailed technical references are linked, not included. Markdown is the maintained source; use approved inputs and templates for the reporting cycle.</w:t>
       </w:r>
     </w:p>
     <w:bookmarkStart w:id="14" w:name="X303ccac7b492492bb67a8351f4c88d254864801"/>
@@ -1088,7 +1080,7 @@
     </w:p>
     <w:bookmarkEnd w:id="13"/>
     <w:bookmarkEnd w:id="14"/>
-    <w:bookmarkStart w:id="21" w:name="operating-controls-run-checklist"/>
+    <w:bookmarkStart w:id="20" w:name="operating-controls-run-checklist"/>
     <w:p>
       <w:pPr>
         <w:pStyle w:val="Heading1"/>
@@ -1381,223 +1373,7 @@
       </w:r>
     </w:p>
     <w:bookmarkEnd w:id="19"/>
-    <w:bookmarkStart w:id="20" w:name="source-identity"/>
-    <w:p>
-      <w:pPr>
-        <w:pStyle w:val="Heading2"/>
-      </w:pPr>
-      <w:r>
-        <w:t xml:space="preserve">Source identity</w:t>
-      </w:r>
-    </w:p>
-    <w:p>
-      <w:pPr>
-        <w:pStyle w:val="Compact"/>
-        <w:numPr>
-          <w:ilvl w:val="0"/>
-          <w:numId w:val="1018"/>
-        </w:numPr>
-      </w:pPr>
-      <w:r>
-        <w:t xml:space="preserve">Git revision:</w:t>
-      </w:r>
-      <w:r>
-        <w:t xml:space="preserve"> </w:t>
-      </w:r>
-      <w:r>
-        <w:rPr>
-          <w:rStyle w:val="VerbatimChar"/>
-        </w:rPr>
-        <w:t xml:space="preserve">e24520a521577b73e2f98d6ddc64525d320b12b0</w:t>
-      </w:r>
-      <w:r>
-        <w:t xml:space="preserve"> </w:t>
-      </w:r>
-      <w:r>
-        <w:t xml:space="preserve">(the working tree may contain uncommitted changes).</w:t>
-      </w:r>
-    </w:p>
-    <w:p>
-      <w:pPr>
-        <w:pStyle w:val="Compact"/>
-        <w:numPr>
-          <w:ilvl w:val="0"/>
-          <w:numId w:val="1018"/>
-        </w:numPr>
-      </w:pPr>
-      <w:r>
-        <w:t xml:space="preserve">Builder SHA-256:</w:t>
-      </w:r>
-      <w:r>
-        <w:t xml:space="preserve"> </w:t>
-      </w:r>
-      <w:r>
-        <w:rPr>
-          <w:rStyle w:val="VerbatimChar"/>
-        </w:rPr>
-        <w:t xml:space="preserve">865d85a521d3e2696c1a42dfd93528077803da83719ca46d3141a0066f77919f</w:t>
-      </w:r>
-      <w:r>
-        <w:t xml:space="preserve">.</w:t>
-      </w:r>
-    </w:p>
-    <w:p>
-      <w:pPr>
-        <w:pStyle w:val="Compact"/>
-        <w:numPr>
-          <w:ilvl w:val="0"/>
-          <w:numId w:val="1018"/>
-        </w:numPr>
-      </w:pPr>
-      <w:r>
-        <w:t xml:space="preserve">Assembly semantics:</w:t>
-      </w:r>
-      <w:r>
-        <w:t xml:space="preserve"> </w:t>
-      </w:r>
-      <w:r>
-        <w:rPr>
-          <w:rStyle w:val="VerbatimChar"/>
-        </w:rPr>
-        <w:t xml:space="preserve">docx-source-manifest-v1; stable-heading-anchors-v1; generated-link-rebase-v1; human-guides-only-v2</w:t>
-      </w:r>
-      <w:r>
-        <w:t xml:space="preserve">.</w:t>
-      </w:r>
-    </w:p>
-    <w:p>
-      <w:pPr>
-        <w:pStyle w:val="Compact"/>
-        <w:numPr>
-          <w:ilvl w:val="0"/>
-          <w:numId w:val="1018"/>
-        </w:numPr>
-      </w:pPr>
-      <w:r>
-        <w:t xml:space="preserve">Exact input-doc manifest SHA-256:</w:t>
-      </w:r>
-      <w:r>
-        <w:t xml:space="preserve"> </w:t>
-      </w:r>
-      <w:r>
-        <w:rPr>
-          <w:rStyle w:val="VerbatimChar"/>
-        </w:rPr>
-        <w:t xml:space="preserve">8b107a53d257d87a903d74f0d79e175c0d835bc0fbec832e71844d6c33e613b2</w:t>
-      </w:r>
-      <w:r>
-        <w:t xml:space="preserve">.</w:t>
-      </w:r>
-    </w:p>
-    <w:p>
-      <w:pPr>
-        <w:pStyle w:val="FirstParagraph"/>
-      </w:pPr>
-      <w:r>
-        <w:t xml:space="preserve">The per-file hashes below are computed from the current UTF-8 bytes, so uncommitted Markdown edits remain distinguishable even when the Git revision is unchanged:</w:t>
-      </w:r>
-    </w:p>
-    <w:tbl>
-      <w:tblPr>
-        <w:tblStyle w:val="Table"/>
-        <w:tblW w:type="pct" w:w="5000"/>
-        <w:tblLayout w:type="fixed"/>
-        <w:tblLook w:firstRow="1" w:lastRow="0" w:firstColumn="0" w:lastColumn="0" w:noHBand="0" w:noVBand="0" w:val="0020"/>
-      </w:tblPr>
-      <w:tblGrid>
-        <w:gridCol w:w="3960"/>
-        <w:gridCol w:w="3960"/>
-      </w:tblGrid>
-      <w:tr>
-        <w:trPr>
-          <w:tblHeader w:val="on"/>
-        </w:trPr>
-        <w:tc>
-          <w:tcPr/>
-          <w:p>
-            <w:pPr>
-              <w:pStyle w:val="Compact"/>
-            </w:pPr>
-            <w:r>
-              <w:t xml:space="preserve">Included source</w:t>
-            </w:r>
-          </w:p>
-        </w:tc>
-        <w:tc>
-          <w:tcPr/>
-          <w:p>
-            <w:pPr>
-              <w:pStyle w:val="Compact"/>
-            </w:pPr>
-            <w:r>
-              <w:t xml:space="preserve">SHA-256</w:t>
-            </w:r>
-          </w:p>
-        </w:tc>
-      </w:tr>
-      <w:tr>
-        <w:tc>
-          <w:tcPr/>
-          <w:p>
-            <w:pPr>
-              <w:pStyle w:val="Compact"/>
-            </w:pPr>
-            <w:r>
-              <w:rPr>
-                <w:rStyle w:val="VerbatimChar"/>
-              </w:rPr>
-              <w:t xml:space="preserve">docs/bscr/runbook.md</w:t>
-            </w:r>
-          </w:p>
-        </w:tc>
-        <w:tc>
-          <w:tcPr/>
-          <w:p>
-            <w:pPr>
-              <w:pStyle w:val="Compact"/>
-            </w:pPr>
-            <w:r>
-              <w:rPr>
-                <w:rStyle w:val="VerbatimChar"/>
-              </w:rPr>
-              <w:t xml:space="preserve">deb5041fff0732f9887392d2416f9c6b580e1b514445854d655df47c367d6991</w:t>
-            </w:r>
-          </w:p>
-        </w:tc>
-      </w:tr>
-      <w:tr>
-        <w:tc>
-          <w:tcPr/>
-          <w:p>
-            <w:pPr>
-              <w:pStyle w:val="Compact"/>
-            </w:pPr>
-            <w:r>
-              <w:rPr>
-                <w:rStyle w:val="VerbatimChar"/>
-              </w:rPr>
-              <w:t xml:space="preserve">docs/operating-controls.md</w:t>
-            </w:r>
-          </w:p>
-        </w:tc>
-        <w:tc>
-          <w:tcPr/>
-          <w:p>
-            <w:pPr>
-              <w:pStyle w:val="Compact"/>
-            </w:pPr>
-            <w:r>
-              <w:rPr>
-                <w:rStyle w:val="VerbatimChar"/>
-              </w:rPr>
-              <w:t xml:space="preserve">064cd9201e216d0f6c0258c9cc398782448e2f059ed7bbedc14be18691513a00</w:t>
-            </w:r>
-          </w:p>
-        </w:tc>
-      </w:tr>
-    </w:tbl>
     <w:bookmarkEnd w:id="20"/>
-    <w:bookmarkEnd w:id="21"/>
     <w:sectPr>
       <w:footnotePr>
         <w:numRestart w:val="eachSect"/>
@@ -2052,9 +1828,6 @@
   </w:num>
   <w:num w:numId="1017">
     <w:abstractNumId w:val="992"/>
-  </w:num>
-  <w:num w:numId="1018">
-    <w:abstractNumId w:val="991"/>
   </w:num>
 </w:numbering>
 </file>

</xml_diff>

<commit_message>
Simplify remaining operator runbooks and remove appended checklists
</commit_message>
<xml_diff>
--- a/docs/generated/BSCR-Jan-2026.docx
+++ b/docs/generated/BSCR-Jan-2026.docx
@@ -18,297 +18,22 @@
         <w:t xml:space="preserve">January 2026</w:t>
       </w:r>
     </w:p>
-    <w:bookmarkStart w:id="14" w:name="X303ccac7b492492bb67a8351f4c88d254864801"/>
+    <w:bookmarkStart w:id="13" w:name="bscr-runbook-bscr-sql-csv-and-python"/>
     <w:p>
       <w:pPr>
         <w:pStyle w:val="Heading1"/>
       </w:pPr>
       <w:r>
-        <w:t xml:space="preserve">BSCR Schedule X — offline operator guide</w:t>
-      </w:r>
-    </w:p>
-    <w:bookmarkStart w:id="9" w:name="bscr-runbook-scope-and-result"/>
+        <w:t xml:space="preserve">BSCR — SQL, CSV and Python</w:t>
+      </w:r>
+    </w:p>
+    <w:bookmarkStart w:id="9" w:name="bscr-runbook-run-the-calculation"/>
     <w:p>
       <w:pPr>
         <w:pStyle w:val="Heading2"/>
       </w:pPr>
       <w:r>
-        <w:t xml:space="preserve">Scope and result</w:t>
-      </w:r>
-    </w:p>
-    <w:p>
-      <w:pPr>
-        <w:pStyle w:val="FirstParagraph"/>
-      </w:pPr>
-      <w:r>
-        <w:t xml:space="preserve">This guide runs the BSCR calculation from an approved SQL export and produces reviewed exposure files; it does</w:t>
-      </w:r>
-      <w:r>
-        <w:t xml:space="preserve"> </w:t>
-      </w:r>
-      <w:r>
-        <w:rPr>
-          <w:b/>
-          <w:bCs/>
-        </w:rPr>
-        <w:t xml:space="preserve">not</w:t>
-      </w:r>
-      <w:r>
-        <w:t xml:space="preserve"> </w:t>
-      </w:r>
-      <w:r>
-        <w:t xml:space="preserve">produce a complete Schedule X return, final-cell submission, EP curves, premiums, narratives, model classifications, or distinct-contract counts.</w:t>
-      </w:r>
-    </w:p>
-    <w:p>
-      <w:pPr>
-        <w:pStyle w:val="BodyText"/>
-      </w:pPr>
-      <w:r>
-        <w:t xml:space="preserve">The calculation PC needs Python 3.13+ and the repository only; Excel,</w:t>
-      </w:r>
-      <w:r>
-        <w:t xml:space="preserve"> </w:t>
-      </w:r>
-      <w:r>
-        <w:rPr>
-          <w:rStyle w:val="VerbatimChar"/>
-        </w:rPr>
-        <w:t xml:space="preserve">uv</w:t>
-      </w:r>
-      <w:r>
-        <w:t xml:space="preserve">, ODBC, and a live database connection are not required. An approved SQL-export host remains responsible for producing the input CSV.</w:t>
-      </w:r>
-    </w:p>
-    <w:bookmarkEnd w:id="9"/>
-    <w:bookmarkStart w:id="10" w:name="bscr-runbook-files-and-contract"/>
-    <w:p>
-      <w:pPr>
-        <w:pStyle w:val="Heading2"/>
-      </w:pPr>
-      <w:r>
-        <w:t xml:space="preserve">Files and contract</w:t>
-      </w:r>
-    </w:p>
-    <w:p>
-      <w:pPr>
-        <w:pStyle w:val="FirstParagraph"/>
-      </w:pPr>
-      <w:r>
-        <w:t xml:space="preserve">All paths are relative to the repository root. Each input folder is one approved snapshot with one approved peril and policy selection.</w:t>
-      </w:r>
-    </w:p>
-    <w:tbl>
-      <w:tblPr>
-        <w:tblStyle w:val="Table"/>
-        <w:tblW w:type="pct" w:w="5000"/>
-        <w:tblLayout w:type="fixed"/>
-        <w:tblLook w:firstRow="1" w:lastRow="0" w:firstColumn="0" w:lastColumn="0" w:noHBand="0" w:noVBand="0" w:val="0020"/>
-      </w:tblPr>
-      <w:tblGrid>
-        <w:gridCol w:w="3960"/>
-        <w:gridCol w:w="3960"/>
-      </w:tblGrid>
-      <w:tr>
-        <w:trPr>
-          <w:tblHeader w:val="on"/>
-        </w:trPr>
-        <w:tc>
-          <w:tcPr/>
-          <w:p>
-            <w:pPr>
-              <w:pStyle w:val="Compact"/>
-            </w:pPr>
-            <w:r>
-              <w:t xml:space="preserve">File</w:t>
-            </w:r>
-          </w:p>
-        </w:tc>
-        <w:tc>
-          <w:tcPr/>
-          <w:p>
-            <w:pPr>
-              <w:pStyle w:val="Compact"/>
-            </w:pPr>
-            <w:r>
-              <w:t xml:space="preserve">Required contract</w:t>
-            </w:r>
-          </w:p>
-        </w:tc>
-      </w:tr>
-      <w:tr>
-        <w:tc>
-          <w:tcPr/>
-          <w:p>
-            <w:pPr>
-              <w:pStyle w:val="Compact"/>
-            </w:pPr>
-            <w:r>
-              <w:rPr>
-                <w:rStyle w:val="VerbatimChar"/>
-              </w:rPr>
-              <w:t xml:space="preserve">bscr-source.csv</w:t>
-            </w:r>
-          </w:p>
-        </w:tc>
-        <w:tc>
-          <w:tcPr/>
-          <w:p>
-            <w:pPr>
-              <w:pStyle w:val="Compact"/>
-            </w:pPr>
-            <w:r>
-              <w:t xml:space="preserve">Input file, with this exact header and order:</w:t>
-            </w:r>
-            <w:r>
-              <w:t xml:space="preserve"> </w:t>
-            </w:r>
-            <w:r>
-              <w:rPr>
-                <w:rStyle w:val="VerbatimChar"/>
-              </w:rPr>
-              <w:t xml:space="preserve">pml,accgrpid,uwritrname,state,userid1,branchname,cntrycode,is_geocoded</w:t>
-            </w:r>
-          </w:p>
-        </w:tc>
-      </w:tr>
-      <w:tr>
-        <w:tc>
-          <w:tcPr/>
-          <w:p>
-            <w:pPr>
-              <w:pStyle w:val="Compact"/>
-            </w:pPr>
-            <w:r>
-              <w:rPr>
-                <w:rStyle w:val="VerbatimChar"/>
-              </w:rPr>
-              <w:t xml:space="preserve">bscr-output.csv</w:t>
-            </w:r>
-          </w:p>
-        </w:tc>
-        <w:tc>
-          <w:tcPr/>
-          <w:p>
-            <w:pPr>
-              <w:pStyle w:val="Compact"/>
-            </w:pPr>
-            <w:r>
-              <w:t xml:space="preserve">Script output, with this exact header and order:</w:t>
-            </w:r>
-            <w:r>
-              <w:t xml:space="preserve"> </w:t>
-            </w:r>
-            <w:r>
-              <w:rPr>
-                <w:rStyle w:val="VerbatimChar"/>
-              </w:rPr>
-              <w:t xml:space="preserve">cntrycode,bscr_entity,region,sum_pml,sum_net,count_policies,is_geocoded</w:t>
-            </w:r>
-          </w:p>
-        </w:tc>
-      </w:tr>
-      <w:tr>
-        <w:tc>
-          <w:tcPr/>
-          <w:p>
-            <w:pPr>
-              <w:pStyle w:val="Compact"/>
-            </w:pPr>
-            <w:r>
-              <w:rPr>
-                <w:rStyle w:val="VerbatimChar"/>
-              </w:rPr>
-              <w:t xml:space="preserve">bscr/sql/bscr-extract.sql</w:t>
-            </w:r>
-          </w:p>
-        </w:tc>
-        <w:tc>
-          <w:tcPr/>
-          <w:p>
-            <w:pPr>
-              <w:pStyle w:val="Compact"/>
-            </w:pPr>
-            <w:r>
-              <w:t xml:space="preserve">Separate SQL-export query; its defaults are</w:t>
-            </w:r>
-            <w:r>
-              <w:t xml:space="preserve"> </w:t>
-            </w:r>
-            <w:r>
-              <w:rPr>
-                <w:rStyle w:val="VerbatimChar"/>
-              </w:rPr>
-              <w:t xml:space="preserve">@peril = 1</w:t>
-            </w:r>
-            <w:r>
-              <w:t xml:space="preserve"> </w:t>
-            </w:r>
-            <w:r>
-              <w:t xml:space="preserve">and</w:t>
-            </w:r>
-            <w:r>
-              <w:t xml:space="preserve"> </w:t>
-            </w:r>
-            <w:r>
-              <w:rPr>
-                <w:rStyle w:val="VerbatimChar"/>
-              </w:rPr>
-              <w:t xml:space="preserve">@policy_type = 1</w:t>
-            </w:r>
-            <w:r>
-              <w:t xml:space="preserve">, but the approved cycle values control the export</w:t>
-            </w:r>
-          </w:p>
-        </w:tc>
-      </w:tr>
-    </w:tbl>
-    <w:p>
-      <w:pPr>
-        <w:pStyle w:val="BodyText"/>
-      </w:pPr>
-      <w:r>
-        <w:t xml:space="preserve">The checked-in workbooks</w:t>
-      </w:r>
-      <w:r>
-        <w:t xml:space="preserve"> </w:t>
-      </w:r>
-      <w:r>
-        <w:rPr>
-          <w:rStyle w:val="VerbatimChar"/>
-        </w:rPr>
-        <w:t xml:space="preserve">bscr/workbooks/Workings_with_geocodingFW - Including blanks USD.xlsx</w:t>
-      </w:r>
-      <w:r>
-        <w:t xml:space="preserve"> </w:t>
-      </w:r>
-      <w:r>
-        <w:t xml:space="preserve">and</w:t>
-      </w:r>
-      <w:r>
-        <w:t xml:space="preserve"> </w:t>
-      </w:r>
-      <w:r>
-        <w:rPr>
-          <w:rStyle w:val="VerbatimChar"/>
-        </w:rPr>
-        <w:t xml:space="preserve">bscr/workbooks/2026 BSCR - UKEU - HIC.xlsx</w:t>
-      </w:r>
-      <w:r>
-        <w:t xml:space="preserve"> </w:t>
-      </w:r>
-      <w:r>
-        <w:t xml:space="preserve">are historical/reference files only; they are not calculation inputs, and this runbook does not require opening or refreshing them.</w:t>
-      </w:r>
-    </w:p>
-    <w:bookmarkEnd w:id="10"/>
-    <w:bookmarkStart w:id="11" w:name="bscr-runbook-numbered-operator-steps"/>
-    <w:p>
-      <w:pPr>
-        <w:pStyle w:val="Heading2"/>
-      </w:pPr>
-      <w:r>
-        <w:t xml:space="preserve">Numbered operator steps</w:t>
+        <w:t xml:space="preserve">Run the calculation</w:t>
       </w:r>
     </w:p>
     <w:p>
@@ -320,7 +45,7 @@
         </w:numPr>
       </w:pPr>
       <w:r>
-        <w:t xml:space="preserve">Create an input folder for one snapshot and peril/policy selection, such as</w:t>
+        <w:t xml:space="preserve">Run</w:t>
       </w:r>
       <w:r>
         <w:t xml:space="preserve"> </w:t>
@@ -329,10 +54,55 @@
         <w:rPr>
           <w:rStyle w:val="VerbatimChar"/>
         </w:rPr>
-        <w:t xml:space="preserve">runs\eq\input</w:t>
-      </w:r>
-      <w:r>
-        <w:t xml:space="preserve">.</w:t>
+        <w:t xml:space="preserve">bscr/sql/bscr-extract.sql</w:t>
+      </w:r>
+      <w:r>
+        <w:t xml:space="preserve"> </w:t>
+      </w:r>
+      <w:r>
+        <w:t xml:space="preserve">against the correct EDM database, checking</w:t>
+      </w:r>
+      <w:r>
+        <w:t xml:space="preserve"> </w:t>
+      </w:r>
+      <w:r>
+        <w:rPr>
+          <w:rStyle w:val="VerbatimChar"/>
+        </w:rPr>
+        <w:t xml:space="preserve">@peril</w:t>
+      </w:r>
+      <w:r>
+        <w:t xml:space="preserve"> </w:t>
+      </w:r>
+      <w:r>
+        <w:t xml:space="preserve">and</w:t>
+      </w:r>
+      <w:r>
+        <w:t xml:space="preserve"> </w:t>
+      </w:r>
+      <w:r>
+        <w:rPr>
+          <w:rStyle w:val="VerbatimChar"/>
+        </w:rPr>
+        <w:t xml:space="preserve">@policy_type</w:t>
+      </w:r>
+      <w:r>
+        <w:t xml:space="preserve"> </w:t>
+      </w:r>
+      <w:r>
+        <w:t xml:space="preserve">for the required run (the file defaults to</w:t>
+      </w:r>
+      <w:r>
+        <w:t xml:space="preserve"> </w:t>
+      </w:r>
+      <w:r>
+        <w:rPr>
+          <w:rStyle w:val="VerbatimChar"/>
+        </w:rPr>
+        <w:t xml:space="preserve">1/1</w:t>
+      </w:r>
+      <w:r>
+        <w:t xml:space="preserve">).</w:t>
       </w:r>
     </w:p>
     <w:p>
@@ -344,7 +114,7 @@
         </w:numPr>
       </w:pPr>
       <w:r>
-        <w:t xml:space="preserve">On the SQL-export host, run</w:t>
+        <w:t xml:space="preserve">Export the result as a CSV with these headers:</w:t>
       </w:r>
       <w:r>
         <w:t xml:space="preserve"> </w:t>
@@ -353,28 +123,10 @@
         <w:rPr>
           <w:rStyle w:val="VerbatimChar"/>
         </w:rPr>
-        <w:t xml:space="preserve">bscr/sql/bscr-extract.sql</w:t>
-      </w:r>
-      <w:r>
-        <w:t xml:space="preserve"> </w:t>
-      </w:r>
-      <w:r>
-        <w:t xml:space="preserve">with the approved peril and policy values and save the result with headers as</w:t>
-      </w:r>
-      <w:r>
-        <w:t xml:space="preserve"> </w:t>
-      </w:r>
-      <w:r>
-        <w:rPr>
-          <w:rStyle w:val="VerbatimChar"/>
-        </w:rPr>
-        <w:t xml:space="preserve">bscr-source.csv</w:t>
-      </w:r>
-      <w:r>
-        <w:t xml:space="preserve"> </w:t>
-      </w:r>
-      <w:r>
-        <w:t xml:space="preserve">in that folder, retaining parameters and source totals.</w:t>
+        <w:t xml:space="preserve">pml, accgrpid, uwritrname, state, userid1, branchname, cntrycode, is_geocoded</w:t>
+      </w:r>
+      <w:r>
+        <w:t xml:space="preserve">.</w:t>
       </w:r>
     </w:p>
     <w:p>
@@ -386,7 +138,7 @@
         </w:numPr>
       </w:pPr>
       <w:r>
-        <w:t xml:space="preserve">From the repository root on the calculation PC, create the one-time environment with</w:t>
+        <w:t xml:space="preserve">Copy the CSV to the calculation PC and open</w:t>
       </w:r>
       <w:r>
         <w:t xml:space="preserve"> </w:t>
@@ -395,22 +147,7 @@
         <w:rPr>
           <w:rStyle w:val="VerbatimChar"/>
         </w:rPr>
-        <w:t xml:space="preserve">python -m venv .venv</w:t>
-      </w:r>
-      <w:r>
-        <w:t xml:space="preserve"> </w:t>
-      </w:r>
-      <w:r>
-        <w:t xml:space="preserve">and Windows dependencies with</w:t>
-      </w:r>
-      <w:r>
-        <w:t xml:space="preserve"> </w:t>
-      </w:r>
-      <w:r>
-        <w:rPr>
-          <w:rStyle w:val="VerbatimChar"/>
-        </w:rPr>
-        <w:t xml:space="preserve">.venv\Scripts\python -m pip install -r bscr\requirements.txt</w:t>
+        <w:t xml:space="preserve">bscr/BSCR_UKEU.py</w:t>
       </w:r>
       <w:r>
         <w:t xml:space="preserve">.</w:t>
@@ -425,7 +162,22 @@
         </w:numPr>
       </w:pPr>
       <w:r>
-        <w:t xml:space="preserve">Ensure the output directory is absent or empty before starting and do not reuse it for another snapshot.</w:t>
+        <w:t xml:space="preserve">Set the CSV filename and output folder at the top of the file using the example below, leaving</w:t>
+      </w:r>
+      <w:r>
+        <w:t xml:space="preserve"> </w:t>
+      </w:r>
+      <w:r>
+        <w:rPr>
+          <w:rStyle w:val="VerbatimChar"/>
+        </w:rPr>
+        <w:t xml:space="preserve">PRA_INPUT_CSV = None</w:t>
+      </w:r>
+      <w:r>
+        <w:t xml:space="preserve"> </w:t>
+      </w:r>
+      <w:r>
+        <w:t xml:space="preserve">for BSCR only.</w:t>
       </w:r>
     </w:p>
     <w:p>
@@ -437,79 +189,7 @@
         </w:numPr>
       </w:pPr>
       <w:r>
-        <w:t xml:space="preserve">Set</w:t>
-      </w:r>
-      <w:r>
-        <w:t xml:space="preserve"> </w:t>
-      </w:r>
-      <w:r>
-        <w:rPr>
-          <w:rStyle w:val="VerbatimChar"/>
-        </w:rPr>
-        <w:t xml:space="preserve">BSCR_INPUT_CSV</w:t>
-      </w:r>
-      <w:r>
-        <w:t xml:space="preserve">,</w:t>
-      </w:r>
-      <w:r>
-        <w:t xml:space="preserve"> </w:t>
-      </w:r>
-      <w:r>
-        <w:rPr>
-          <w:rStyle w:val="VerbatimChar"/>
-        </w:rPr>
-        <w:t xml:space="preserve">PRA_INPUT_CSV</w:t>
-      </w:r>
-      <w:r>
-        <w:t xml:space="preserve"> </w:t>
-      </w:r>
-      <w:r>
-        <w:t xml:space="preserve">and</w:t>
-      </w:r>
-      <w:r>
-        <w:t xml:space="preserve"> </w:t>
-      </w:r>
-      <w:r>
-        <w:rPr>
-          <w:rStyle w:val="VerbatimChar"/>
-        </w:rPr>
-        <w:t xml:space="preserve">OUTPUT_DIR</w:t>
-      </w:r>
-      <w:r>
-        <w:t xml:space="preserve"> </w:t>
-      </w:r>
-      <w:r>
-        <w:t xml:space="preserve">at the top of</w:t>
-      </w:r>
-      <w:r>
-        <w:t xml:space="preserve"> </w:t>
-      </w:r>
-      <w:r>
-        <w:rPr>
-          <w:rStyle w:val="VerbatimChar"/>
-        </w:rPr>
-        <w:t xml:space="preserve">bscr/BSCR_UKEU.py</w:t>
-      </w:r>
-      <w:r>
-        <w:t xml:space="preserve"> </w:t>
-      </w:r>
-      <w:r>
-        <w:t xml:space="preserve">using the example below, then run</w:t>
-      </w:r>
-      <w:r>
-        <w:t xml:space="preserve"> </w:t>
-      </w:r>
-      <w:r>
-        <w:rPr>
-          <w:rStyle w:val="VerbatimChar"/>
-        </w:rPr>
-        <w:t xml:space="preserve">.venv\Scripts\python bscr/BSCR_UKEU.py</w:t>
-      </w:r>
-      <w:r>
-        <w:t xml:space="preserve"> </w:t>
-      </w:r>
-      <w:r>
-        <w:t xml:space="preserve">with no arguments.</w:t>
+        <w:t xml:space="preserve">Use a new or empty output folder so old and new results cannot be mixed.</w:t>
       </w:r>
     </w:p>
     <w:p>
@@ -521,7 +201,7 @@
         </w:numPr>
       </w:pPr>
       <w:r>
-        <w:t xml:space="preserve">Confirm that the run completes and that</w:t>
+        <w:t xml:space="preserve">Run</w:t>
       </w:r>
       <w:r>
         <w:t xml:space="preserve"> </w:t>
@@ -530,13 +210,13 @@
         <w:rPr>
           <w:rStyle w:val="VerbatimChar"/>
         </w:rPr>
-        <w:t xml:space="preserve">bscr-output.csv</w:t>
-      </w:r>
-      <w:r>
-        <w:t xml:space="preserve"> </w:t>
-      </w:r>
-      <w:r>
-        <w:t xml:space="preserve">in your output folder has the exact seven-column header and non-partial contents.</w:t>
+        <w:t xml:space="preserve">.venv\Scripts\python bscr/BSCR_UKEU.py</w:t>
+      </w:r>
+      <w:r>
+        <w:t xml:space="preserve"> </w:t>
+      </w:r>
+      <w:r>
+        <w:t xml:space="preserve">from the repository folder, with no arguments.</w:t>
       </w:r>
     </w:p>
     <w:p>
@@ -548,7 +228,37 @@
         </w:numPr>
       </w:pPr>
       <w:r>
-        <w:t xml:space="preserve">Reconcile source and output row counts, gross/net totals, entity and region totals, country/state frequencies, geocode splits, and unexplained nulls or unmapped values before review.</w:t>
+        <w:t xml:space="preserve">Open</w:t>
+      </w:r>
+      <w:r>
+        <w:t xml:space="preserve"> </w:t>
+      </w:r>
+      <w:r>
+        <w:rPr>
+          <w:rStyle w:val="VerbatimChar"/>
+        </w:rPr>
+        <w:t xml:space="preserve">bscr-output.csv</w:t>
+      </w:r>
+      <w:r>
+        <w:t xml:space="preserve"> </w:t>
+      </w:r>
+      <w:r>
+        <w:t xml:space="preserve">in the configured output folder and reconcile the</w:t>
+      </w:r>
+      <w:r>
+        <w:t xml:space="preserve"> </w:t>
+      </w:r>
+      <w:r>
+        <w:rPr>
+          <w:rStyle w:val="VerbatimChar"/>
+        </w:rPr>
+        <w:t xml:space="preserve">ALL</w:t>
+      </w:r>
+      <w:r>
+        <w:t xml:space="preserve"> </w:t>
+      </w:r>
+      <w:r>
+        <w:t xml:space="preserve">rows’ gross totals and contributing-row counts to the source CSV.</w:t>
       </w:r>
     </w:p>
     <w:p>
@@ -560,7 +270,29 @@
         </w:numPr>
       </w:pPr>
       <w:r>
-        <w:t xml:space="preserve">Retain the input CSV, output CSV, query revision and parameters, source controls, run command, code revision, reconciliation, exceptions, and reviewer record together as the run evidence.</w:t>
+        <w:t xml:space="preserve">Check retained/net totals, entity, geography and geocode splits, and investigate missing mappings or unexplained differences.</w:t>
+      </w:r>
+    </w:p>
+    <w:p>
+      <w:pPr>
+        <w:pStyle w:val="Compact"/>
+        <w:numPr>
+          <w:ilvl w:val="0"/>
+          <w:numId w:val="1001"/>
+        </w:numPr>
+      </w:pPr>
+      <w:r>
+        <w:t xml:space="preserve">Save the input CSV, output, SQL parameters, database snapshot and reconciliation together.</w:t>
+      </w:r>
+    </w:p>
+    <w:bookmarkEnd w:id="9"/>
+    <w:bookmarkStart w:id="10" w:name="bscr-runbook-set-the-paths"/>
+    <w:p>
+      <w:pPr>
+        <w:pStyle w:val="Heading2"/>
+      </w:pPr>
+      <w:r>
+        <w:t xml:space="preserve">Set the paths</w:t>
       </w:r>
     </w:p>
     <w:p>
@@ -568,7 +300,7 @@
         <w:pStyle w:val="FirstParagraph"/>
       </w:pPr>
       <w:r>
-        <w:t xml:space="preserve">Edit this configuration block at the top of the Python file, replacing the example locations with your actual paths:</w:t>
+        <w:t xml:space="preserve">Replace these example paths at the top of the Python file:</w:t>
       </w:r>
     </w:p>
     <w:p>
@@ -613,6 +345,90 @@
       </w:r>
       <w:r>
         <w:rPr>
+          <w:rStyle w:val="DecValTok"/>
+        </w:rPr>
+        <w:t xml:space="preserve">\m</w:t>
+      </w:r>
+      <w:r>
+        <w:rPr>
+          <w:rStyle w:val="VerbatimStringTok"/>
+        </w:rPr>
+        <w:t xml:space="preserve">y BSCR extract</w:t>
+      </w:r>
+      <w:r>
+        <w:rPr>
+          <w:rStyle w:val="DecValTok"/>
+        </w:rPr>
+        <w:t xml:space="preserve">.</w:t>
+      </w:r>
+      <w:r>
+        <w:rPr>
+          <w:rStyle w:val="VerbatimStringTok"/>
+        </w:rPr>
+        <w:t xml:space="preserve">csv"</w:t>
+      </w:r>
+      <w:r>
+        <w:rPr>
+          <w:rStyle w:val="NormalTok"/>
+        </w:rPr>
+        <w:t xml:space="preserve">)</w:t>
+      </w:r>
+      <w:r>
+        <w:br/>
+      </w:r>
+      <w:r>
+        <w:rPr>
+          <w:rStyle w:val="NormalTok"/>
+        </w:rPr>
+        <w:t xml:space="preserve">PRA_INPUT_CSV </w:t>
+      </w:r>
+      <w:r>
+        <w:rPr>
+          <w:rStyle w:val="OperatorTok"/>
+        </w:rPr>
+        <w:t xml:space="preserve">=</w:t>
+      </w:r>
+      <w:r>
+        <w:rPr>
+          <w:rStyle w:val="NormalTok"/>
+        </w:rPr>
+        <w:t xml:space="preserve"> </w:t>
+      </w:r>
+      <w:r>
+        <w:rPr>
+          <w:rStyle w:val="VariableTok"/>
+        </w:rPr>
+        <w:t xml:space="preserve">None</w:t>
+      </w:r>
+      <w:r>
+        <w:br/>
+      </w:r>
+      <w:r>
+        <w:rPr>
+          <w:rStyle w:val="NormalTok"/>
+        </w:rPr>
+        <w:t xml:space="preserve">OUTPUT_DIR </w:t>
+      </w:r>
+      <w:r>
+        <w:rPr>
+          <w:rStyle w:val="OperatorTok"/>
+        </w:rPr>
+        <w:t xml:space="preserve">=</w:t>
+      </w:r>
+      <w:r>
+        <w:rPr>
+          <w:rStyle w:val="NormalTok"/>
+        </w:rPr>
+        <w:t xml:space="preserve"> Path(</w:t>
+      </w:r>
+      <w:r>
+        <w:rPr>
+          <w:rStyle w:val="VerbatimStringTok"/>
+        </w:rPr>
+        <w:t xml:space="preserve">r"C:</w:t>
+      </w:r>
+      <w:r>
+        <w:rPr>
           <w:rStyle w:val="ErrorTok"/>
         </w:rPr>
         <w:t xml:space="preserve">\</w:t>
@@ -621,145 +437,97 @@
         <w:rPr>
           <w:rStyle w:val="VerbatimStringTok"/>
         </w:rPr>
-        <w:t xml:space="preserve">eq</w:t>
-      </w:r>
-      <w:r>
-        <w:rPr>
-          <w:rStyle w:val="ErrorTok"/>
-        </w:rPr>
-        <w:t xml:space="preserve">\</w:t>
+        <w:t xml:space="preserve">Returns</w:t>
+      </w:r>
+      <w:r>
+        <w:rPr>
+          <w:rStyle w:val="DecValTok"/>
+        </w:rPr>
+        <w:t xml:space="preserve">\b</w:t>
       </w:r>
       <w:r>
         <w:rPr>
           <w:rStyle w:val="VerbatimStringTok"/>
         </w:rPr>
-        <w:t xml:space="preserve">input</w:t>
-      </w:r>
-      <w:r>
-        <w:rPr>
-          <w:rStyle w:val="DecValTok"/>
-        </w:rPr>
-        <w:t xml:space="preserve">\m</w:t>
-      </w:r>
-      <w:r>
-        <w:rPr>
-          <w:rStyle w:val="VerbatimStringTok"/>
-        </w:rPr>
-        <w:t xml:space="preserve">y BSCR extract</w:t>
-      </w:r>
-      <w:r>
-        <w:rPr>
-          <w:rStyle w:val="DecValTok"/>
-        </w:rPr>
+        <w:t xml:space="preserve">scr-output"</w:t>
+      </w:r>
+      <w:r>
+        <w:rPr>
+          <w:rStyle w:val="NormalTok"/>
+        </w:rPr>
+        <w:t xml:space="preserve">)</w:t>
+      </w:r>
+    </w:p>
+    <w:p>
+      <w:pPr>
+        <w:pStyle w:val="FirstParagraph"/>
+      </w:pPr>
+      <w:r>
+        <w:t xml:space="preserve">The input path includes the</w:t>
+      </w:r>
+      <w:r>
+        <w:t xml:space="preserve"> </w:t>
+      </w:r>
+      <w:r>
+        <w:rPr>
+          <w:b/>
+          <w:bCs/>
+        </w:rPr>
+        <w:t xml:space="preserve">CSV filename</w:t>
+      </w:r>
+      <w:r>
+        <w:t xml:space="preserve">; the output path is a</w:t>
+      </w:r>
+      <w:r>
+        <w:t xml:space="preserve"> </w:t>
+      </w:r>
+      <w:r>
+        <w:rPr>
+          <w:b/>
+          <w:bCs/>
+        </w:rPr>
+        <w:t xml:space="preserve">folder</w:t>
+      </w:r>
+      <w:r>
         <w:t xml:space="preserve">.</w:t>
       </w:r>
-      <w:r>
-        <w:rPr>
-          <w:rStyle w:val="VerbatimStringTok"/>
-        </w:rPr>
-        <w:t xml:space="preserve">csv"</w:t>
-      </w:r>
-      <w:r>
-        <w:rPr>
-          <w:rStyle w:val="NormalTok"/>
-        </w:rPr>
-        <w:t xml:space="preserve">)</w:t>
+    </w:p>
+    <w:bookmarkEnd w:id="10"/>
+    <w:bookmarkStart w:id="11" w:name="bscr-runbook-one-time-python-setup"/>
+    <w:p>
+      <w:pPr>
+        <w:pStyle w:val="Heading2"/>
+      </w:pPr>
+      <w:r>
+        <w:t xml:space="preserve">One-time Python setup</w:t>
+      </w:r>
+    </w:p>
+    <w:p>
+      <w:pPr>
+        <w:pStyle w:val="FirstParagraph"/>
+      </w:pPr>
+      <w:r>
+        <w:t xml:space="preserve">Use Python 3.13+ and run these commands from the repository folder on Windows:</w:t>
+      </w:r>
+    </w:p>
+    <w:p>
+      <w:pPr>
+        <w:pStyle w:val="SourceCode"/>
+      </w:pPr>
+      <w:r>
+        <w:rPr>
+          <w:rStyle w:val="VerbatimChar"/>
+        </w:rPr>
+        <w:t xml:space="preserve">python -m venv .venv</w:t>
       </w:r>
       <w:r>
         <w:br/>
       </w:r>
       <w:r>
         <w:rPr>
-          <w:rStyle w:val="NormalTok"/>
-        </w:rPr>
-        <w:t xml:space="preserve">PRA_INPUT_CSV </w:t>
-      </w:r>
-      <w:r>
-        <w:rPr>
-          <w:rStyle w:val="OperatorTok"/>
-        </w:rPr>
-        <w:t xml:space="preserve">=</w:t>
-      </w:r>
-      <w:r>
-        <w:rPr>
-          <w:rStyle w:val="NormalTok"/>
-        </w:rPr>
-        <w:t xml:space="preserve"> </w:t>
-      </w:r>
-      <w:r>
-        <w:rPr>
-          <w:rStyle w:val="VariableTok"/>
-        </w:rPr>
-        <w:t xml:space="preserve">None</w:t>
-      </w:r>
-      <w:r>
-        <w:br/>
-      </w:r>
-      <w:r>
-        <w:rPr>
-          <w:rStyle w:val="NormalTok"/>
-        </w:rPr>
-        <w:t xml:space="preserve">OUTPUT_DIR </w:t>
-      </w:r>
-      <w:r>
-        <w:rPr>
-          <w:rStyle w:val="OperatorTok"/>
-        </w:rPr>
-        <w:t xml:space="preserve">=</w:t>
-      </w:r>
-      <w:r>
-        <w:rPr>
-          <w:rStyle w:val="NormalTok"/>
-        </w:rPr>
-        <w:t xml:space="preserve"> Path(</w:t>
-      </w:r>
-      <w:r>
-        <w:rPr>
-          <w:rStyle w:val="VerbatimStringTok"/>
-        </w:rPr>
-        <w:t xml:space="preserve">r"C:</w:t>
-      </w:r>
-      <w:r>
-        <w:rPr>
-          <w:rStyle w:val="ErrorTok"/>
-        </w:rPr>
-        <w:t xml:space="preserve">\</w:t>
-      </w:r>
-      <w:r>
-        <w:rPr>
-          <w:rStyle w:val="VerbatimStringTok"/>
-        </w:rPr>
-        <w:t xml:space="preserve">Returns</w:t>
-      </w:r>
-      <w:r>
-        <w:rPr>
-          <w:rStyle w:val="ErrorTok"/>
-        </w:rPr>
-        <w:t xml:space="preserve">\</w:t>
-      </w:r>
-      <w:r>
-        <w:rPr>
-          <w:rStyle w:val="VerbatimStringTok"/>
-        </w:rPr>
-        <w:t xml:space="preserve">eq</w:t>
-      </w:r>
-      <w:r>
-        <w:rPr>
-          <w:rStyle w:val="ErrorTok"/>
-        </w:rPr>
-        <w:t xml:space="preserve">\</w:t>
-      </w:r>
-      <w:r>
-        <w:rPr>
-          <w:rStyle w:val="VerbatimStringTok"/>
-        </w:rPr>
-        <w:t xml:space="preserve">output"</w:t>
-      </w:r>
-      <w:r>
-        <w:rPr>
-          <w:rStyle w:val="NormalTok"/>
-        </w:rPr>
-        <w:t xml:space="preserve">)</w:t>
+          <w:rStyle w:val="VerbatimChar"/>
+        </w:rPr>
+        <w:t xml:space="preserve">.venv\Scripts\python -m pip install -r bscr\requirements.txt</w:t>
       </w:r>
     </w:p>
     <w:p>
@@ -767,7 +535,7 @@
         <w:pStyle w:val="FirstParagraph"/>
       </w:pPr>
       <w:r>
-        <w:t xml:space="preserve">Include the CSV filename in</w:t>
+        <w:t xml:space="preserve">The calculation PC needs neither database access nor</w:t>
       </w:r>
       <w:r>
         <w:t xml:space="preserve"> </w:t>
@@ -776,10 +544,16 @@
         <w:rPr>
           <w:rStyle w:val="VerbatimChar"/>
         </w:rPr>
-        <w:t xml:space="preserve">BSCR_INPUT_CSV</w:t>
-      </w:r>
-      <w:r>
-        <w:t xml:space="preserve">;</w:t>
+        <w:t xml:space="preserve">uv</w:t>
+      </w:r>
+      <w:r>
+        <w:t xml:space="preserve">; SQL runs separately where database access is available.</w:t>
+      </w:r>
+      <w:r>
+        <w:t xml:space="preserve"> </w:t>
+      </w:r>
+      <w:r>
+        <w:t xml:space="preserve">On macOS/Linux use</w:t>
       </w:r>
       <w:r>
         <w:t xml:space="preserve"> </w:t>
@@ -788,133 +562,35 @@
         <w:rPr>
           <w:rStyle w:val="VerbatimChar"/>
         </w:rPr>
-        <w:t xml:space="preserve">None</w:t>
-      </w:r>
-      <w:r>
-        <w:t xml:space="preserve"> </w:t>
-      </w:r>
-      <w:r>
-        <w:t xml:space="preserve">skips PRA, and setting both CSV paths runs both calculations.</w:t>
+        <w:t xml:space="preserve">.venv/bin/python</w:t>
+      </w:r>
+      <w:r>
+        <w:t xml:space="preserve"> </w:t>
+      </w:r>
+      <w:r>
+        <w:t xml:space="preserve">instead of</w:t>
+      </w:r>
+      <w:r>
+        <w:t xml:space="preserve"> </w:t>
+      </w:r>
+      <w:r>
+        <w:rPr>
+          <w:rStyle w:val="VerbatimChar"/>
+        </w:rPr>
+        <w:t xml:space="preserve">.venv\Scripts\python</w:t>
+      </w:r>
+      <w:r>
+        <w:t xml:space="preserve">.</w:t>
       </w:r>
     </w:p>
     <w:bookmarkEnd w:id="11"/>
-    <w:bookmarkStart w:id="12" w:name="bscr-runbook-interpret-the-output-safely"/>
+    <w:bookmarkStart w:id="12" w:name="X8cd9516fc13fcf8cd284e0651aef0802723e055"/>
     <w:p>
       <w:pPr>
         <w:pStyle w:val="Heading2"/>
       </w:pPr>
       <w:r>
-        <w:t xml:space="preserve">Interpret the output safely</w:t>
-      </w:r>
-    </w:p>
-    <w:p>
-      <w:pPr>
-        <w:pStyle w:val="FirstParagraph"/>
-      </w:pPr>
-      <w:r>
-        <w:rPr>
-          <w:rStyle w:val="VerbatimChar"/>
-        </w:rPr>
-        <w:t xml:space="preserve">sum_pml</w:t>
-      </w:r>
-      <w:r>
-        <w:t xml:space="preserve"> </w:t>
-      </w:r>
-      <w:r>
-        <w:t xml:space="preserve">is gross source-currency exposure before retention,</w:t>
-      </w:r>
-      <w:r>
-        <w:t xml:space="preserve"> </w:t>
-      </w:r>
-      <w:r>
-        <w:rPr>
-          <w:rStyle w:val="VerbatimChar"/>
-        </w:rPr>
-        <w:t xml:space="preserve">sum_net</w:t>
-      </w:r>
-      <w:r>
-        <w:t xml:space="preserve"> </w:t>
-      </w:r>
-      <w:r>
-        <w:t xml:space="preserve">applies the current Python retention logic, and</w:t>
-      </w:r>
-      <w:r>
-        <w:t xml:space="preserve"> </w:t>
-      </w:r>
-      <w:r>
-        <w:rPr>
-          <w:rStyle w:val="VerbatimChar"/>
-        </w:rPr>
-        <w:t xml:space="preserve">count_policies</w:t>
-      </w:r>
-      <w:r>
-        <w:t xml:space="preserve"> </w:t>
-      </w:r>
-      <w:r>
-        <w:t xml:space="preserve">is a contributing grouped/source-row count rather than a guaranteed distinct policy or contract count.</w:t>
-      </w:r>
-      <w:r>
-        <w:t xml:space="preserve"> </w:t>
-      </w:r>
-      <w:r>
-        <w:rPr>
-          <w:rStyle w:val="VerbatimChar"/>
-        </w:rPr>
-        <w:t xml:space="preserve">ALL</w:t>
-      </w:r>
-      <w:r>
-        <w:t xml:space="preserve"> </w:t>
-      </w:r>
-      <w:r>
-        <w:t xml:space="preserve">and regional rows are overlapping views, so never add regional rows together or treat them as separate peril extracts. A new peril selection requires its own approved SQL snapshot; changing a region filter is not a substitute for a separate peril extraction.</w:t>
-      </w:r>
-    </w:p>
-    <w:p>
-      <w:pPr>
-        <w:pStyle w:val="BodyText"/>
-      </w:pPr>
-      <w:r>
-        <w:t xml:space="preserve">Record source currency explicitly: Python does not convert currency, and a USD-labelled historical workbook view does not make a source-currency CSV USD. The historical workings workbook applied a hard-coded</w:t>
-      </w:r>
-      <w:r>
-        <w:t xml:space="preserve"> </w:t>
-      </w:r>
-      <w:r>
-        <w:rPr>
-          <w:rStyle w:val="VerbatimChar"/>
-        </w:rPr>
-        <w:t xml:space="preserve">1.35</w:t>
-      </w:r>
-      <w:r>
-        <w:t xml:space="preserve"> </w:t>
-      </w:r>
-      <w:r>
-        <w:t xml:space="preserve">conversion and</w:t>
-      </w:r>
-      <w:r>
-        <w:t xml:space="preserve"> </w:t>
-      </w:r>
-      <w:r>
-        <w:rPr>
-          <w:rStyle w:val="VerbatimChar"/>
-        </w:rPr>
-        <w:t xml:space="preserve">/1,000,000</w:t>
-      </w:r>
-      <w:r>
-        <w:t xml:space="preserve"> </w:t>
-      </w:r>
-      <w:r>
-        <w:t xml:space="preserve">scaling, but those workbook mechanics are not part of this offline CSV calculation.</w:t>
-      </w:r>
-    </w:p>
-    <w:bookmarkEnd w:id="12"/>
-    <w:bookmarkStart w:id="13" w:name="X6af4424e20da6c9bfc525781bd16911be77e23c"/>
-    <w:p>
-      <w:pPr>
-        <w:pStyle w:val="Heading2"/>
-      </w:pPr>
-      <w:r>
-        <w:t xml:space="preserve">Stop conditions and current blockers</w:t>
+        <w:t xml:space="preserve">Check before using the output</w:t>
       </w:r>
     </w:p>
     <w:p>
@@ -926,7 +602,7 @@
         </w:numPr>
       </w:pPr>
       <w:r>
-        <w:t xml:space="preserve">Stop for a missing, partial, reordered, or extra-header input; a non-empty output directory; a failed run; a missing output; unexplained control-total differences; or unexplained join multiplication.</w:t>
+        <w:t xml:space="preserve">Keep source currency and units: the script does not convert to USD or millions.</w:t>
       </w:r>
     </w:p>
     <w:p>
@@ -938,7 +614,7 @@
         </w:numPr>
       </w:pPr>
       <w:r>
-        <w:t xml:space="preserve">The policy join is not proven to be policy-grain safe because</w:t>
+        <w:t xml:space="preserve">Do not add overlapping regional rows together or treat</w:t>
       </w:r>
       <w:r>
         <w:t xml:space="preserve"> </w:t>
@@ -947,13 +623,13 @@
         <w:rPr>
           <w:rStyle w:val="VerbatimChar"/>
         </w:rPr>
-        <w:t xml:space="preserve">policyid</w:t>
-      </w:r>
-      <w:r>
-        <w:t xml:space="preserve"> </w:t>
-      </w:r>
-      <w:r>
-        <w:t xml:space="preserve">is omitted from downstream grouping; multiple policy/geography rows can multiply exposure, so review join diagnostics before relying on totals.</w:t>
+        <w:t xml:space="preserve">count_policies</w:t>
+      </w:r>
+      <w:r>
+        <w:t xml:space="preserve"> </w:t>
+      </w:r>
+      <w:r>
+        <w:t xml:space="preserve">as distinct contracts.</w:t>
       </w:r>
     </w:p>
     <w:p>
@@ -965,22 +641,7 @@
         </w:numPr>
       </w:pPr>
       <w:r>
-        <w:t xml:space="preserve">The current</w:t>
-      </w:r>
-      <w:r>
-        <w:t xml:space="preserve"> </w:t>
-      </w:r>
-      <w:r>
-        <w:rPr>
-          <w:rStyle w:val="VerbatimChar"/>
-        </w:rPr>
-        <w:t xml:space="preserve">is_nahu()</w:t>
-      </w:r>
-      <w:r>
-        <w:t xml:space="preserve"> </w:t>
-      </w:r>
-      <w:r>
-        <w:t xml:space="preserve">implementation classifies every US row as NAHU because its intended state allow-list is bypassed; do not describe this as approved coastal-state logic.</w:t>
+        <w:t xml:space="preserve">Confirm the existing retention rules (QS 50%, SRP 33.33%, QS first) and geography rules: the current hurricane flag includes every US row.</w:t>
       </w:r>
     </w:p>
     <w:p>
@@ -992,354 +653,7 @@
         </w:numPr>
       </w:pPr>
       <w:r>
-        <w:t xml:space="preserve">Retention remains</w:t>
-      </w:r>
-      <w:r>
-        <w:t xml:space="preserve"> </w:t>
-      </w:r>
-      <w:r>
-        <w:rPr>
-          <w:rStyle w:val="VerbatimChar"/>
-        </w:rPr>
-        <w:t xml:space="preserve">_QS = 0.50</w:t>
-      </w:r>
-      <w:r>
-        <w:t xml:space="preserve">,</w:t>
-      </w:r>
-      <w:r>
-        <w:t xml:space="preserve"> </w:t>
-      </w:r>
-      <w:r>
-        <w:rPr>
-          <w:rStyle w:val="VerbatimChar"/>
-        </w:rPr>
-        <w:t xml:space="preserve">_SRP = 0.3333</w:t>
-      </w:r>
-      <w:r>
-        <w:t xml:space="preserve">, otherwise</w:t>
-      </w:r>
-      <w:r>
-        <w:t xml:space="preserve"> </w:t>
-      </w:r>
-      <w:r>
-        <w:rPr>
-          <w:rStyle w:val="VerbatimChar"/>
-        </w:rPr>
-        <w:t xml:space="preserve">1.00</w:t>
-      </w:r>
-      <w:r>
-        <w:t xml:space="preserve">, with</w:t>
-      </w:r>
-      <w:r>
-        <w:t xml:space="preserve"> </w:t>
-      </w:r>
-      <w:r>
-        <w:rPr>
-          <w:rStyle w:val="VerbatimChar"/>
-        </w:rPr>
-        <w:t xml:space="preserve">_QS</w:t>
-      </w:r>
-      <w:r>
-        <w:t xml:space="preserve"> </w:t>
-      </w:r>
-      <w:r>
-        <w:t xml:space="preserve">taking precedence when both markers occur; source currency, FX direction, and annual rate approval remain open.</w:t>
-      </w:r>
-    </w:p>
-    <w:p>
-      <w:pPr>
-        <w:pStyle w:val="Compact"/>
-        <w:numPr>
-          <w:ilvl w:val="0"/>
-          <w:numId w:val="1002"/>
-        </w:numPr>
-      </w:pPr>
-      <w:r>
-        <w:t xml:space="preserve">Approval of all-peril codes and the final source snapshot is unresolved, so defaults are convenience values rather than cycle approval.</w:t>
-      </w:r>
-    </w:p>
-    <w:p>
-      <w:pPr>
-        <w:pStyle w:val="Compact"/>
-        <w:numPr>
-          <w:ilvl w:val="0"/>
-          <w:numId w:val="1002"/>
-        </w:numPr>
-      </w:pPr>
-      <w:r>
-        <w:t xml:space="preserve">The final HIC template has no approved source-to-cell map and cannot be inferred from labels, colours, cached values, or prior layouts; the checked-in template also contains documented formula/link defects.</w:t>
-      </w:r>
-    </w:p>
-    <w:p>
-      <w:pPr>
-        <w:pStyle w:val="FirstParagraph"/>
-      </w:pPr>
-      <w:r>
-        <w:t xml:space="preserve">The output is reviewed BSCR exposure input only. Historical workbooks may be used for comparison after the CSV reconciliation, but they are optional and do not convert this run into an approved final return.</w:t>
-      </w:r>
-    </w:p>
-    <w:bookmarkEnd w:id="13"/>
-    <w:bookmarkEnd w:id="14"/>
-    <w:bookmarkStart w:id="20" w:name="operating-controls-run-checklist"/>
-    <w:p>
-      <w:pPr>
-        <w:pStyle w:val="Heading1"/>
-      </w:pPr>
-      <w:r>
-        <w:t xml:space="preserve">Run checklist</w:t>
-      </w:r>
-    </w:p>
-    <w:p>
-      <w:pPr>
-        <w:pStyle w:val="FirstParagraph"/>
-      </w:pPr>
-      <w:hyperlink r:id="rId15">
-        <w:r>
-          <w:rPr>
-            <w:rStyle w:val="Hyperlink"/>
-          </w:rPr>
-          <w:t xml:space="preserve">Start here</w:t>
-        </w:r>
-      </w:hyperlink>
-      <w:r>
-        <w:t xml:space="preserve"> </w:t>
-      </w:r>
-      <w:r>
-        <w:t xml:space="preserve">·</w:t>
-      </w:r>
-      <w:r>
-        <w:t xml:space="preserve"> </w:t>
-      </w:r>
-      <w:hyperlink r:id="rId16">
-        <w:r>
-          <w:rPr>
-            <w:rStyle w:val="Hyperlink"/>
-          </w:rPr>
-          <w:t xml:space="preserve">Detailed controls for LLMs/reviewers</w:t>
-        </w:r>
-      </w:hyperlink>
-    </w:p>
-    <w:p>
-      <w:pPr>
-        <w:pStyle w:val="BodyText"/>
-      </w:pPr>
-      <w:r>
-        <w:t xml:space="preserve">Use this alongside your process guide. Keep the evidence in a new, restricted</w:t>
-      </w:r>
-      <w:r>
-        <w:t xml:space="preserve"> </w:t>
-      </w:r>
-      <w:r>
-        <w:t xml:space="preserve">run folder—not in source control. Mark irrelevant checks N/A with a reason.</w:t>
-      </w:r>
-    </w:p>
-    <w:bookmarkStart w:id="17" w:name="operating-controls-before-you-start"/>
-    <w:p>
-      <w:pPr>
-        <w:pStyle w:val="Heading2"/>
-      </w:pPr>
-      <w:r>
-        <w:t xml:space="preserve">Before you start</w:t>
-      </w:r>
-    </w:p>
-    <w:p>
-      <w:pPr>
-        <w:pStyle w:val="Compact"/>
-        <w:numPr>
-          <w:ilvl w:val="0"/>
-          <w:numId w:val="1003"/>
-        </w:numPr>
-      </w:pPr>
-      <w:r>
-        <w:t xml:space="preserve">Confirm the reporting period, source snapshot, scope and controlled template.</w:t>
-      </w:r>
-    </w:p>
-    <w:p>
-      <w:pPr>
-        <w:pStyle w:val="Compact"/>
-        <w:numPr>
-          <w:ilvl w:val="0"/>
-          <w:numId w:val="1004"/>
-        </w:numPr>
-      </w:pPr>
-      <w:r>
-        <w:t xml:space="preserve">Confirm the approved mappings, retention/proxy rules, scale factors, FX and units.</w:t>
-      </w:r>
-    </w:p>
-    <w:p>
-      <w:pPr>
-        <w:pStyle w:val="Compact"/>
-        <w:numPr>
-          <w:ilvl w:val="0"/>
-          <w:numId w:val="1005"/>
-        </w:numPr>
-      </w:pPr>
-      <w:r>
-        <w:t xml:space="preserve">Record the operator, reviewer, code version, exact command/query and output folder. Keep credentials out of the record.</w:t>
-      </w:r>
-    </w:p>
-    <w:p>
-      <w:pPr>
-        <w:pStyle w:val="Compact"/>
-        <w:numPr>
-          <w:ilvl w:val="0"/>
-          <w:numId w:val="1006"/>
-        </w:numPr>
-      </w:pPr>
-      <w:r>
-        <w:t xml:space="preserve">Agree independent control totals and acceptable differences with the reviewer.</w:t>
-      </w:r>
-    </w:p>
-    <w:p>
-      <w:pPr>
-        <w:pStyle w:val="Compact"/>
-        <w:numPr>
-          <w:ilvl w:val="0"/>
-          <w:numId w:val="1007"/>
-        </w:numPr>
-      </w:pPr>
-      <w:r>
-        <w:t xml:space="preserve">For Excel, work on a copy. Identify input ranges, formulas, tables, pivot sources and external links before changing anything.</w:t>
-      </w:r>
-    </w:p>
-    <w:p>
-      <w:pPr>
-        <w:pStyle w:val="Compact"/>
-        <w:numPr>
-          <w:ilvl w:val="0"/>
-          <w:numId w:val="1008"/>
-        </w:numPr>
-      </w:pPr>
-      <w:r>
-        <w:t xml:space="preserve">Resolve the blockers listed in your guide before doing the affected step.</w:t>
-      </w:r>
-    </w:p>
-    <w:bookmarkEnd w:id="17"/>
-    <w:bookmarkStart w:id="18" w:name="operating-controls-run-and-check"/>
-    <w:p>
-      <w:pPr>
-        <w:pStyle w:val="Heading2"/>
-      </w:pPr>
-      <w:r>
-        <w:t xml:space="preserve">Run and check</w:t>
-      </w:r>
-    </w:p>
-    <w:p>
-      <w:pPr>
-        <w:pStyle w:val="Compact"/>
-        <w:numPr>
-          <w:ilvl w:val="0"/>
-          <w:numId w:val="1009"/>
-        </w:numPr>
-      </w:pPr>
-      <w:r>
-        <w:t xml:space="preserve">Save the raw outputs, logs, parameters and row counts. Use a stable snapshot when running multiple queries.</w:t>
-      </w:r>
-    </w:p>
-    <w:p>
-      <w:pPr>
-        <w:pStyle w:val="Compact"/>
-        <w:numPr>
-          <w:ilvl w:val="0"/>
-          <w:numId w:val="1010"/>
-        </w:numPr>
-      </w:pPr>
-      <w:r>
-        <w:t xml:space="preserve">Check joins have not multiplied exposure; investigate missing mappings, geography, currency or other required values.</w:t>
-      </w:r>
-    </w:p>
-    <w:p>
-      <w:pPr>
-        <w:pStyle w:val="Compact"/>
-        <w:numPr>
-          <w:ilvl w:val="0"/>
-          <w:numId w:val="1011"/>
-        </w:numPr>
-      </w:pPr>
-      <w:r>
-        <w:t xml:space="preserve">Reconcile source → raw output → grouped output by relevant entity, peril and geography, including gross/net and FX movements.</w:t>
-      </w:r>
-    </w:p>
-    <w:p>
-      <w:pPr>
-        <w:pStyle w:val="Compact"/>
-        <w:numPr>
-          <w:ilvl w:val="0"/>
-          <w:numId w:val="1012"/>
-        </w:numPr>
-      </w:pPr>
-      <w:r>
-        <w:t xml:space="preserve">Before loading Excel, check headers/order, row counts, currency and units. Replace input rows only; preserve formulas and report areas.</w:t>
-      </w:r>
-    </w:p>
-    <w:p>
-      <w:pPr>
-        <w:pStyle w:val="Compact"/>
-        <w:numPr>
-          <w:ilvl w:val="0"/>
-          <w:numId w:val="1013"/>
-        </w:numPr>
-      </w:pPr>
-      <w:r>
-        <w:t xml:space="preserve">Extend approved formulas and table/pivot ranges to all new rows; remove stale input rows. Do not copy known inconsistent formulas or blindly refresh external links.</w:t>
-      </w:r>
-    </w:p>
-    <w:p>
-      <w:pPr>
-        <w:pStyle w:val="Compact"/>
-        <w:numPr>
-          <w:ilvl w:val="0"/>
-          <w:numId w:val="1014"/>
-        </w:numPr>
-      </w:pPr>
-      <w:r>
-        <w:t xml:space="preserve">Recalculate in Excel and reconcile report totals. Investigate errors, stale values and unexplained movements.</w:t>
-      </w:r>
-    </w:p>
-    <w:bookmarkEnd w:id="18"/>
-    <w:bookmarkStart w:id="19" w:name="operating-controls-finish"/>
-    <w:p>
-      <w:pPr>
-        <w:pStyle w:val="Heading2"/>
-      </w:pPr>
-      <w:r>
-        <w:t xml:space="preserve">Finish</w:t>
-      </w:r>
-    </w:p>
-    <w:p>
-      <w:pPr>
-        <w:pStyle w:val="Compact"/>
-        <w:numPr>
-          <w:ilvl w:val="0"/>
-          <w:numId w:val="1015"/>
-        </w:numPr>
-      </w:pPr>
-      <w:r>
-        <w:t xml:space="preserve">Use an approved source-to-destination map for any final-template transfer. Do not choose cells by colour or label alone.</w:t>
-      </w:r>
-    </w:p>
-    <w:p>
-      <w:pPr>
-        <w:pStyle w:val="Compact"/>
-        <w:numPr>
-          <w:ilvl w:val="0"/>
-          <w:numId w:val="1016"/>
-        </w:numPr>
-      </w:pPr>
-      <w:r>
-        <w:t xml:space="preserve">Log each transfer: source file/sheet/range, destination file/sheet/cell, value, measure, currency/unit, as-of date and assumption versions.</w:t>
-      </w:r>
-    </w:p>
-    <w:p>
-      <w:pPr>
-        <w:pStyle w:val="Compact"/>
-        <w:numPr>
-          <w:ilvl w:val="0"/>
-          <w:numId w:val="1017"/>
-        </w:numPr>
-      </w:pPr>
-      <w:r>
-        <w:t xml:space="preserve">Obtain reviewer sign-off and retain inputs, outputs, reconciliations, adjustments and final submission/delivery evidence together.</w:t>
+        <w:t xml:space="preserve">Stop on failed/partial exports, unexplained totals or policy-join multiplication; workbooks are not needed for this calculation.</w:t>
       </w:r>
     </w:p>
     <w:p>
@@ -1351,29 +665,17 @@
           <w:b/>
           <w:bCs/>
         </w:rPr>
-        <w:t xml:space="preserve">Stop if</w:t>
-      </w:r>
-      <w:r>
-        <w:t xml:space="preserve"> </w:t>
-      </w:r>
-      <w:r>
-        <w:t xml:space="preserve">the source or assumptions are unapproved, a formula/pivot/handoff</w:t>
-      </w:r>
-      <w:r>
-        <w:t xml:space="preserve"> </w:t>
-      </w:r>
-      <w:r>
-        <w:t xml:space="preserve">cannot be traced, or differences exceed the agreed tolerance. A successful</w:t>
-      </w:r>
-      <w:r>
-        <w:t xml:space="preserve"> </w:t>
-      </w:r>
-      <w:r>
-        <w:t xml:space="preserve">command or refresh does not mean the return is complete.</w:t>
-      </w:r>
-    </w:p>
-    <w:bookmarkEnd w:id="19"/>
-    <w:bookmarkEnd w:id="20"/>
+        <w:t xml:space="preserve">To return to later:</w:t>
+      </w:r>
+      <w:r>
+        <w:t xml:space="preserve"> </w:t>
+      </w:r>
+      <w:r>
+        <w:t xml:space="preserve">agree where the exposure results go in the final HIC template and obtain the separate EP curves, premiums and contract counts; this CSV is not the complete BSCR return.</w:t>
+      </w:r>
+    </w:p>
+    <w:bookmarkEnd w:id="12"/>
+    <w:bookmarkEnd w:id="13"/>
     <w:sectPr>
       <w:footnotePr>
         <w:numRestart w:val="eachSect"/>
@@ -1670,82 +972,6 @@
       <w:rPr>
         <w:rFonts w:ascii="Wingdings" w:hAnsi="Wingdings" w:cs="Wingdings" w:hint="default"/>
       </w:rPr>
-    </w:lvl>
-  </w:abstractNum>
-  <w:abstractNum w:abstractNumId="992">
-    <w:nsid w:val="0000A992"/>
-    <w:multiLevelType w:val="multilevel"/>
-    <w:lvl w:ilvl="0">
-      <w:numFmt w:val="bullet"/>
-      <w:lvlText w:val="☐"/>
-      <w:lvlJc w:val="left"/>
-      <w:pPr>
-        <w:ind w:left="720" w:hanging="360"/>
-      </w:pPr>
-    </w:lvl>
-    <w:lvl w:ilvl="1">
-      <w:numFmt w:val="bullet"/>
-      <w:lvlText w:val="☐"/>
-      <w:lvlJc w:val="left"/>
-      <w:pPr>
-        <w:ind w:left="1440" w:hanging="360"/>
-      </w:pPr>
-    </w:lvl>
-    <w:lvl w:ilvl="2">
-      <w:numFmt w:val="bullet"/>
-      <w:lvlText w:val="☐"/>
-      <w:lvlJc w:val="left"/>
-      <w:pPr>
-        <w:ind w:left="2160" w:hanging="360"/>
-      </w:pPr>
-    </w:lvl>
-    <w:lvl w:ilvl="3">
-      <w:numFmt w:val="bullet"/>
-      <w:lvlText w:val="☐"/>
-      <w:lvlJc w:val="left"/>
-      <w:pPr>
-        <w:ind w:left="2880" w:hanging="360"/>
-      </w:pPr>
-    </w:lvl>
-    <w:lvl w:ilvl="4">
-      <w:numFmt w:val="bullet"/>
-      <w:lvlText w:val="☐"/>
-      <w:lvlJc w:val="left"/>
-      <w:pPr>
-        <w:ind w:left="3600" w:hanging="360"/>
-      </w:pPr>
-    </w:lvl>
-    <w:lvl w:ilvl="5">
-      <w:numFmt w:val="bullet"/>
-      <w:lvlText w:val="☐"/>
-      <w:lvlJc w:val="left"/>
-      <w:pPr>
-        <w:ind w:left="4320" w:hanging="360"/>
-      </w:pPr>
-    </w:lvl>
-    <w:lvl w:ilvl="6">
-      <w:numFmt w:val="bullet"/>
-      <w:lvlText w:val="☐"/>
-      <w:lvlJc w:val="left"/>
-      <w:pPr>
-        <w:ind w:left="5040" w:hanging="360"/>
-      </w:pPr>
-    </w:lvl>
-    <w:lvl w:ilvl="7">
-      <w:numFmt w:val="bullet"/>
-      <w:lvlText w:val="☐"/>
-      <w:lvlJc w:val="left"/>
-      <w:pPr>
-        <w:ind w:left="5760" w:hanging="360"/>
-      </w:pPr>
-    </w:lvl>
-    <w:lvl w:ilvl="8">
-      <w:numFmt w:val="bullet"/>
-      <w:lvlText w:val="☐"/>
-      <w:lvlJc w:val="left"/>
-      <w:pPr>
-        <w:ind w:left="6480" w:hanging="360"/>
-      </w:pPr>
     </w:lvl>
   </w:abstractNum>
   <w:num w:numId="1000">
@@ -1783,51 +1009,6 @@
   </w:num>
   <w:num w:numId="1002">
     <w:abstractNumId w:val="991"/>
-  </w:num>
-  <w:num w:numId="1003">
-    <w:abstractNumId w:val="992"/>
-  </w:num>
-  <w:num w:numId="1004">
-    <w:abstractNumId w:val="992"/>
-  </w:num>
-  <w:num w:numId="1005">
-    <w:abstractNumId w:val="992"/>
-  </w:num>
-  <w:num w:numId="1006">
-    <w:abstractNumId w:val="992"/>
-  </w:num>
-  <w:num w:numId="1007">
-    <w:abstractNumId w:val="992"/>
-  </w:num>
-  <w:num w:numId="1008">
-    <w:abstractNumId w:val="992"/>
-  </w:num>
-  <w:num w:numId="1009">
-    <w:abstractNumId w:val="992"/>
-  </w:num>
-  <w:num w:numId="1010">
-    <w:abstractNumId w:val="992"/>
-  </w:num>
-  <w:num w:numId="1011">
-    <w:abstractNumId w:val="992"/>
-  </w:num>
-  <w:num w:numId="1012">
-    <w:abstractNumId w:val="992"/>
-  </w:num>
-  <w:num w:numId="1013">
-    <w:abstractNumId w:val="992"/>
-  </w:num>
-  <w:num w:numId="1014">
-    <w:abstractNumId w:val="992"/>
-  </w:num>
-  <w:num w:numId="1015">
-    <w:abstractNumId w:val="992"/>
-  </w:num>
-  <w:num w:numId="1016">
-    <w:abstractNumId w:val="992"/>
-  </w:num>
-  <w:num w:numId="1017">
-    <w:abstractNumId w:val="992"/>
   </w:num>
 </w:numbering>
 </file>

</xml_diff>

<commit_message>
Use locked Python projects instead of duplicate requirements files
</commit_message>
<xml_diff>
--- a/docs/generated/BSCR-Jan-2026.docx
+++ b/docs/generated/BSCR-Jan-2026.docx
@@ -210,13 +210,13 @@
         <w:rPr>
           <w:rStyle w:val="VerbatimChar"/>
         </w:rPr>
-        <w:t xml:space="preserve">.venv\Scripts\python bscr/BSCR_UKEU.py</w:t>
-      </w:r>
-      <w:r>
-        <w:t xml:space="preserve"> </w:t>
-      </w:r>
-      <w:r>
-        <w:t xml:space="preserve">from the repository folder, with no arguments.</w:t>
+        <w:t xml:space="preserve">uv run --isolated --locked python bscr/BSCR_UKEU.py</w:t>
+      </w:r>
+      <w:r>
+        <w:t xml:space="preserve"> </w:t>
+      </w:r>
+      <w:r>
+        <w:t xml:space="preserve">from the repository folder, with no script arguments.</w:t>
       </w:r>
     </w:p>
     <w:p>
@@ -493,13 +493,13 @@
       </w:r>
     </w:p>
     <w:bookmarkEnd w:id="10"/>
-    <w:bookmarkStart w:id="11" w:name="bscr-runbook-one-time-python-setup"/>
+    <w:bookmarkStart w:id="11" w:name="bscr-runbook-dependencies"/>
     <w:p>
       <w:pPr>
         <w:pStyle w:val="Heading2"/>
       </w:pPr>
       <w:r>
-        <w:t xml:space="preserve">One-time Python setup</w:t>
+        <w:t xml:space="preserve">Dependencies</w:t>
       </w:r>
     </w:p>
     <w:p>
@@ -507,35 +507,34 @@
         <w:pStyle w:val="FirstParagraph"/>
       </w:pPr>
       <w:r>
-        <w:t xml:space="preserve">Use Python 3.13+ and run these commands from the repository folder on Windows:</w:t>
-      </w:r>
-    </w:p>
-    <w:p>
-      <w:pPr>
-        <w:pStyle w:val="SourceCode"/>
-      </w:pPr>
+        <w:t xml:space="preserve">UV reads the repository’s</w:t>
+      </w:r>
+      <w:r>
+        <w:t xml:space="preserve"> </w:t>
+      </w:r>
       <w:r>
         <w:rPr>
           <w:rStyle w:val="VerbatimChar"/>
         </w:rPr>
-        <w:t xml:space="preserve">python -m venv .venv</w:t>
-      </w:r>
-      <w:r>
-        <w:br/>
+        <w:t xml:space="preserve">pyproject.toml</w:t>
+      </w:r>
+      <w:r>
+        <w:t xml:space="preserve"> </w:t>
+      </w:r>
+      <w:r>
+        <w:t xml:space="preserve">and</w:t>
+      </w:r>
+      <w:r>
+        <w:t xml:space="preserve"> </w:t>
       </w:r>
       <w:r>
         <w:rPr>
           <w:rStyle w:val="VerbatimChar"/>
         </w:rPr>
-        <w:t xml:space="preserve">.venv\Scripts\python -m pip install -r bscr\requirements.txt</w:t>
-      </w:r>
-    </w:p>
-    <w:p>
-      <w:pPr>
-        <w:pStyle w:val="FirstParagraph"/>
-      </w:pPr>
-      <w:r>
-        <w:t xml:space="preserve">The calculation PC needs neither database access nor</w:t>
+        <w:t xml:space="preserve">uv.lock</w:t>
+      </w:r>
+      <w:r>
+        <w:t xml:space="preserve">;</w:t>
       </w:r>
       <w:r>
         <w:t xml:space="preserve"> </w:t>
@@ -544,16 +543,19 @@
         <w:rPr>
           <w:rStyle w:val="VerbatimChar"/>
         </w:rPr>
-        <w:t xml:space="preserve">uv</w:t>
-      </w:r>
-      <w:r>
-        <w:t xml:space="preserve">; SQL runs separately where database access is available.</w:t>
-      </w:r>
-      <w:r>
-        <w:t xml:space="preserve"> </w:t>
-      </w:r>
-      <w:r>
-        <w:t xml:space="preserve">On macOS/Linux use</w:t>
+        <w:t xml:space="preserve">--isolated</w:t>
+      </w:r>
+      <w:r>
+        <w:t xml:space="preserve"> </w:t>
+      </w:r>
+      <w:r>
+        <w:t xml:space="preserve">avoids</w:t>
+      </w:r>
+      <w:r>
+        <w:t xml:space="preserve"> </w:t>
+      </w:r>
+      <w:r>
+        <w:t xml:space="preserve">creating a local</w:t>
       </w:r>
       <w:r>
         <w:t xml:space="preserve"> </w:t>
@@ -562,13 +564,10 @@
         <w:rPr>
           <w:rStyle w:val="VerbatimChar"/>
         </w:rPr>
-        <w:t xml:space="preserve">.venv/bin/python</w:t>
-      </w:r>
-      <w:r>
-        <w:t xml:space="preserve"> </w:t>
-      </w:r>
-      <w:r>
-        <w:t xml:space="preserve">instead of</w:t>
+        <w:t xml:space="preserve">.venv</w:t>
+      </w:r>
+      <w:r>
+        <w:t xml:space="preserve">, and</w:t>
       </w:r>
       <w:r>
         <w:t xml:space="preserve"> </w:t>
@@ -577,10 +576,19 @@
         <w:rPr>
           <w:rStyle w:val="VerbatimChar"/>
         </w:rPr>
-        <w:t xml:space="preserve">.venv\Scripts\python</w:t>
-      </w:r>
-      <w:r>
-        <w:t xml:space="preserve">.</w:t>
+        <w:t xml:space="preserve">--locked</w:t>
+      </w:r>
+      <w:r>
+        <w:t xml:space="preserve"> </w:t>
+      </w:r>
+      <w:r>
+        <w:t xml:space="preserve">uses the recorded dependency versions.</w:t>
+      </w:r>
+      <w:r>
+        <w:t xml:space="preserve"> </w:t>
+      </w:r>
+      <w:r>
+        <w:t xml:space="preserve">No separate installation step or database connection is needed.</w:t>
       </w:r>
     </w:p>
     <w:bookmarkEnd w:id="11"/>

</xml_diff>